<commit_message>
Add CONVERT_TO field documentation
Co-Authored-By: Claude Opus 4.6 (1M context) <noreply@anthropic.com>
</commit_message>
<xml_diff>
--- a/whitepaper/chronx-whitepaper-v4.5.docx
+++ b/whitepaper/chronx-whitepaper-v4.5.docx
@@ -6201,6 +6201,12 @@
       <w:pPr/>
       <w:r>
         <w:t>TYPE L — Ledger Entry. An immutable on-chain record written exclusively by bonded agents. Each entry contains a BLAKE3 content hash pointing to an off-chain archive, a plaintext summary, and an optional Promise Chain link. The bonding requirement prevents spam. Promise Chain anchors aggregate entry hashes daily into the main chain, creating a legally verifiable audit trail.</w:t>
+      </w:r>
+    </w:p>
+    <w:p>
+      <w:pPr/>
+      <w:r>
+        <w:t>CONVERT_TO Field: Every time-locked promise optionally carries a CONVERT_TO field — a short, open text string recording the grantor’s suggested currency for conversion at maturity. Examples: ‘USDC’, ‘EURO’, ‘BTC’. This field is a suggestion only. The protocol always delivers KX to the recipient wallet regardless of its value. Future third-party conversion services may read this field and offer guaranteed conversion at maturity as an optional premium service. The field has no protocol enforcement, creates no obligation, and generates no liability for any party.</w:t>
       </w:r>
     </w:p>
     <w:p>

</xml_diff>